<commit_message>
Updated the uml diagram to have include and extend
</commit_message>
<xml_diff>
--- a/PES1UG24AM229__SE_LAB.docx
+++ b/PES1UG24AM229__SE_LAB.docx
@@ -180,10 +180,7 @@
         <w:t xml:space="preserve">s removes the two biggest risks occurs in  second-hand trading, </w:t>
       </w:r>
       <w:r>
-        <w:t xml:space="preserve"> buyers </w:t>
-      </w:r>
-      <w:r>
-        <w:t>paying for misrepresented items, and sellers shipping without payment guarantee – by inserting an independent verification and escrow layer between the two parties.</w:t>
+        <w:t xml:space="preserve"> buyers paying for misrepresented items, and sellers shipping without payment guarantee – by inserting an independent verification and escrow layer between the two parties.</w:t>
       </w:r>
     </w:p>
     <w:p>
@@ -235,12 +232,6 @@
         <w:gridCol w:w="1900"/>
       </w:tblGrid>
       <w:tr>
-        <w:tblPrEx>
-          <w:tblCellMar>
-            <w:top w:w="0" w:type="dxa"/>
-            <w:bottom w:w="0" w:type="dxa"/>
-          </w:tblCellMar>
-        </w:tblPrEx>
         <w:tc>
           <w:tcPr>
             <w:tcW w:w="850" w:type="dxa"/>
@@ -321,10 +312,7 @@
               <w:pStyle w:val="Strong1"/>
             </w:pPr>
             <w:r>
-              <w:t>Priorit</w:t>
-            </w:r>
-            <w:r>
-              <w:t>y</w:t>
+              <w:t>Priority</w:t>
             </w:r>
           </w:p>
         </w:tc>
@@ -347,8 +335,6 @@
             <w:r>
               <w:t>Acceptance Criteria</w:t>
             </w:r>
-            <w:bookmarkStart w:id="0" w:name="_GoBack"/>
-            <w:bookmarkEnd w:id="0"/>
           </w:p>
         </w:tc>
         <w:tc>
@@ -374,12 +360,6 @@
         </w:tc>
       </w:tr>
       <w:tr>
-        <w:tblPrEx>
-          <w:tblCellMar>
-            <w:top w:w="0" w:type="dxa"/>
-            <w:bottom w:w="0" w:type="dxa"/>
-          </w:tblCellMar>
-        </w:tblPrEx>
         <w:tc>
           <w:tcPr>
             <w:tcW w:w="850" w:type="dxa"/>
@@ -508,26 +488,12 @@
                 <w:sz w:val="19"/>
                 <w:szCs w:val="19"/>
               </w:rPr>
-              <w:t>Protects the buyer from paying for misrepresented goods while assuring the seller that payment is guaranteed o</w:t>
-            </w:r>
-            <w:r>
-              <w:rPr>
-                <w:color w:val="000000"/>
-                <w:sz w:val="19"/>
-                <w:szCs w:val="19"/>
-              </w:rPr>
-              <w:t>nce verified.</w:t>
+              <w:t>Protects the buyer from paying for misrepresented goods while assuring the seller that payment is guaranteed once verified.</w:t>
             </w:r>
           </w:p>
         </w:tc>
       </w:tr>
       <w:tr>
-        <w:tblPrEx>
-          <w:tblCellMar>
-            <w:top w:w="0" w:type="dxa"/>
-            <w:bottom w:w="0" w:type="dxa"/>
-          </w:tblCellMar>
-        </w:tblPrEx>
         <w:tc>
           <w:tcPr>
             <w:tcW w:w="850" w:type="dxa"/>
@@ -662,12 +628,6 @@
         </w:tc>
       </w:tr>
       <w:tr>
-        <w:tblPrEx>
-          <w:tblCellMar>
-            <w:top w:w="0" w:type="dxa"/>
-            <w:bottom w:w="0" w:type="dxa"/>
-          </w:tblCellMar>
-        </w:tblPrEx>
         <w:tc>
           <w:tcPr>
             <w:tcW w:w="850" w:type="dxa"/>
@@ -730,15 +690,7 @@
                 <w:sz w:val="19"/>
                 <w:szCs w:val="19"/>
               </w:rPr>
-              <w:t>The system shall allow the</w:t>
-            </w:r>
-            <w:r>
-              <w:rPr>
-                <w:color w:val="000000"/>
-                <w:sz w:val="19"/>
-                <w:szCs w:val="19"/>
-              </w:rPr>
-              <w:t xml:space="preserve"> assigned Inspection Agent to submit a structured condition report (checklist and photos) against the listing within the inspection window.</w:t>
+              <w:t>The system shall allow the assigned Inspection Agent to submit a structured condition report (checklist and photos) against the listing within the inspection window.</w:t>
             </w:r>
           </w:p>
         </w:tc>
@@ -782,15 +734,7 @@
                 <w:sz w:val="19"/>
                 <w:szCs w:val="19"/>
               </w:rPr>
-              <w:t xml:space="preserve">Pass: Report with checklist and at least 3 photos is stored and linked to the order. </w:t>
-            </w:r>
-            <w:r>
-              <w:rPr>
-                <w:color w:val="000000"/>
-                <w:sz w:val="19"/>
-                <w:szCs w:val="19"/>
-              </w:rPr>
-              <w:t>Fail: A report lacking checklist or photo evidence is accepted.</w:t>
+              <w:t>Pass: Report with checklist and at least 3 photos is stored and linked to the order. Fail: A report lacking checklist or photo evidence is accepted.</w:t>
             </w:r>
           </w:p>
         </w:tc>
@@ -818,12 +762,6 @@
         </w:tc>
       </w:tr>
       <w:tr>
-        <w:tblPrEx>
-          <w:tblCellMar>
-            <w:top w:w="0" w:type="dxa"/>
-            <w:bottom w:w="0" w:type="dxa"/>
-          </w:tblCellMar>
-        </w:tblPrEx>
         <w:tc>
           <w:tcPr>
             <w:tcW w:w="850" w:type="dxa"/>
@@ -930,15 +868,7 @@
                 <w:sz w:val="19"/>
                 <w:szCs w:val="19"/>
               </w:rPr>
-              <w:t>Pass: Buyer decision is recorded and the correct downstream w</w:t>
-            </w:r>
-            <w:r>
-              <w:rPr>
-                <w:color w:val="000000"/>
-                <w:sz w:val="19"/>
-                <w:szCs w:val="19"/>
-              </w:rPr>
-              <w:t>orkflow (release/dispute) fires within the window. Fail: No action taken, or the wrong workflow is triggered.</w:t>
+              <w:t>Pass: Buyer decision is recorded and the correct downstream workflow (release/dispute) fires within the window. Fail: No action taken, or the wrong workflow is triggered.</w:t>
             </w:r>
           </w:p>
         </w:tc>
@@ -966,12 +896,6 @@
         </w:tc>
       </w:tr>
       <w:tr>
-        <w:tblPrEx>
-          <w:tblCellMar>
-            <w:top w:w="0" w:type="dxa"/>
-            <w:bottom w:w="0" w:type="dxa"/>
-          </w:tblCellMar>
-        </w:tblPrEx>
         <w:tc>
           <w:tcPr>
             <w:tcW w:w="850" w:type="dxa"/>
@@ -1034,23 +958,7 @@
                 <w:sz w:val="19"/>
                 <w:szCs w:val="19"/>
               </w:rPr>
-              <w:t>The system shall let th</w:t>
-            </w:r>
-            <w:r>
-              <w:rPr>
-                <w:color w:val="000000"/>
-                <w:sz w:val="19"/>
-                <w:szCs w:val="19"/>
-              </w:rPr>
-              <w:t>e buyer or seller raise a dispute on a rejected/contested order, freeze escrow funds, and route the case to a</w:t>
-            </w:r>
-            <w:r>
-              <w:rPr>
-                <w:color w:val="000000"/>
-                <w:sz w:val="19"/>
-                <w:szCs w:val="19"/>
-              </w:rPr>
-              <w:t xml:space="preserve"> Dispute Admin for resolution (partial/full refund or release).</w:t>
+              <w:t>The system shall let the buyer or seller raise a dispute on a rejected/contested order, freeze escrow funds, and route the case to a Dispute Admin for resolution (partial/full refund or release).</w:t>
             </w:r>
           </w:p>
         </w:tc>
@@ -1094,15 +1002,7 @@
                 <w:sz w:val="19"/>
                 <w:szCs w:val="19"/>
               </w:rPr>
-              <w:t>Pass: Escrow is frozen immediately on dispute creation and resolved with a d</w:t>
-            </w:r>
-            <w:r>
-              <w:rPr>
-                <w:color w:val="000000"/>
-                <w:sz w:val="19"/>
-                <w:szCs w:val="19"/>
-              </w:rPr>
-              <w:t>ocumented decision. Fail: Funds move while a dispute is open.</w:t>
+              <w:t>Pass: Escrow is frozen immediately on dispute creation and resolved with a documented decision. Fail: Funds move while a dispute is open.</w:t>
             </w:r>
           </w:p>
         </w:tc>
@@ -1170,12 +1070,6 @@
         <w:gridCol w:w="1584"/>
       </w:tblGrid>
       <w:tr>
-        <w:tblPrEx>
-          <w:tblCellMar>
-            <w:top w:w="0" w:type="dxa"/>
-            <w:bottom w:w="0" w:type="dxa"/>
-          </w:tblCellMar>
-        </w:tblPrEx>
         <w:tc>
           <w:tcPr>
             <w:tcW w:w="757" w:type="dxa"/>
@@ -1346,12 +1240,6 @@
         </w:tc>
       </w:tr>
       <w:tr>
-        <w:tblPrEx>
-          <w:tblCellMar>
-            <w:top w:w="0" w:type="dxa"/>
-            <w:bottom w:w="0" w:type="dxa"/>
-          </w:tblCellMar>
-        </w:tblPrEx>
         <w:tc>
           <w:tcPr>
             <w:tcW w:w="757" w:type="dxa"/>
@@ -1486,12 +1374,6 @@
         </w:tc>
       </w:tr>
       <w:tr>
-        <w:tblPrEx>
-          <w:tblCellMar>
-            <w:top w:w="0" w:type="dxa"/>
-            <w:bottom w:w="0" w:type="dxa"/>
-          </w:tblCellMar>
-        </w:tblPrEx>
         <w:tc>
           <w:tcPr>
             <w:tcW w:w="757" w:type="dxa"/>
@@ -1644,13 +1526,7 @@
         <w:spacing w:after="120"/>
       </w:pPr>
       <w:r>
-        <w:t>Primary actors: Buyer, Inspection A</w:t>
-      </w:r>
-      <w:r>
-        <w:t>gent. Secondary actors: Seller, Payment Gateway (external system), Dispute Admin. The diagram below models all actors, the primary use cases, and includes three «include» relationships (Place Order → Make Payment; Place Order → Authenticate User; Request I</w:t>
-      </w:r>
-      <w:r>
-        <w:t>nspection → Send Notification) and one «extend» relationship (Raise Dispute extends Reject Product).</w:t>
+        <w:t>Primary actors: Buyer, Inspection Agent. Secondary actors: Seller, Payment Gateway (external system), Dispute Admin. The diagram below models all actors, the primary use cases, and includes three «include» relationships (Place Order → Make Payment; Place Order → Authenticate User; Request Inspection → Send Notification) and one «extend» relationship (Raise Dispute extends Reject Product).</w:t>
       </w:r>
     </w:p>
     <w:p>
@@ -1663,9 +1539,9 @@
         </w:rPr>
         <w:drawing>
           <wp:inline distT="0" distB="0" distL="0" distR="0">
-            <wp:extent cx="6565653" cy="5006340"/>
-            <wp:effectExtent l="0" t="0" r="6985" b="3810"/>
-            <wp:docPr id="3" name="Picture 3" descr="C:\Users\rohit\Downloads\escrow_marketplace_usecase_final.drawio.png"/>
+            <wp:extent cx="6565265" cy="6629400"/>
+            <wp:effectExtent l="0" t="0" r="6985" b="0"/>
+            <wp:docPr id="2" name="Picture 2" descr="C:\Users\rohit\Downloads\escrow_marketplace_usecase_final.drawio (1).png"/>
             <wp:cNvGraphicFramePr>
               <a:graphicFrameLocks xmlns:a="http://schemas.openxmlformats.org/drawingml/2006/main" noChangeAspect="1"/>
             </wp:cNvGraphicFramePr>
@@ -1673,7 +1549,7 @@
               <a:graphicData uri="http://schemas.openxmlformats.org/drawingml/2006/picture">
                 <pic:pic xmlns:pic="http://schemas.openxmlformats.org/drawingml/2006/picture">
                   <pic:nvPicPr>
-                    <pic:cNvPr id="0" name="Picture 2" descr="C:\Users\rohit\Downloads\escrow_marketplace_usecase_final.drawio.png"/>
+                    <pic:cNvPr id="0" name="Picture 2" descr="C:\Users\rohit\Downloads\escrow_marketplace_usecase_final.drawio (1).png"/>
                     <pic:cNvPicPr>
                       <a:picLocks noChangeAspect="1" noChangeArrowheads="1"/>
                     </pic:cNvPicPr>
@@ -1694,7 +1570,7 @@
                   <pic:spPr bwMode="auto">
                     <a:xfrm>
                       <a:off x="0" y="0"/>
-                      <a:ext cx="6575215" cy="5013631"/>
+                      <a:ext cx="6575194" cy="6639426"/>
                     </a:xfrm>
                     <a:prstGeom prst="rect">
                       <a:avLst/>
@@ -1710,6 +1586,8 @@
           </wp:inline>
         </w:drawing>
       </w:r>
+      <w:bookmarkStart w:id="0" w:name="_GoBack"/>
+      <w:bookmarkEnd w:id="0"/>
     </w:p>
     <w:p>
       <w:pPr>
@@ -1739,10 +1617,7 @@
         <w:spacing w:after="60"/>
       </w:pPr>
       <w:r>
-        <w:t>Buyer (primary): Register/Login, Browse &amp; Search Listings, Place Order &amp; Fund Escrow, Approve Product / Release Escrow, Rejec</w:t>
-      </w:r>
-      <w:r>
-        <w:t>t Product, Raise Dispute</w:t>
+        <w:t>Buyer (primary): Register/Login, Browse &amp; Search Listings, Place Order &amp; Fund Escrow, Approve Product / Release Escrow, Reject Product, Raise Dispute</w:t>
       </w:r>
     </w:p>
     <w:p>
@@ -1794,10 +1669,7 @@
         <w:spacing w:after="60"/>
       </w:pPr>
       <w:r>
-        <w:t>Dispute Admin (secondary): Resolve Dispute &amp;</w:t>
-      </w:r>
-      <w:r>
-        <w:t xml:space="preserve"> Refund</w:t>
+        <w:t>Dispute Admin (secondary): Resolve Dispute &amp; Refund</w:t>
       </w:r>
     </w:p>
     <w:p>
@@ -1861,10 +1733,7 @@
         <w:spacing w:after="120"/>
       </w:pPr>
       <w:r>
-        <w:t>Primary Actor: Buyer   |   Supporting Actors: Inspection Agent, System (Escrow Eng</w:t>
-      </w:r>
-      <w:r>
-        <w:t>ine)</w:t>
+        <w:t>Primary Actor: Buyer   |   Supporting Actors: Inspection Agent, System (Escrow Engine)</w:t>
       </w:r>
     </w:p>
     <w:p>
@@ -1915,10 +1784,7 @@
         <w:spacing w:after="60"/>
       </w:pPr>
       <w:r>
-        <w:t>The order status is “Inspection Complete” and is within the buyer review w</w:t>
-      </w:r>
-      <w:r>
-        <w:t>indow.</w:t>
+        <w:t>The order status is “Inspection Complete” and is within the buyer review window.</w:t>
       </w:r>
     </w:p>
     <w:p>
@@ -2003,10 +1869,7 @@
         <w:spacing w:after="60"/>
       </w:pPr>
       <w:r>
-        <w:t>1. Buyer rece</w:t>
-      </w:r>
-      <w:r>
-        <w:t>ives a notification that the inspection report is ready for review.</w:t>
+        <w:t>1. Buyer receives a notification that the inspection report is ready for review.</w:t>
       </w:r>
     </w:p>
     <w:p>
@@ -2045,10 +1908,7 @@
         <w:spacing w:after="60"/>
       </w:pPr>
       <w:r>
-        <w:t>4. System validates that the order status is “Inspection Co</w:t>
-      </w:r>
-      <w:r>
-        <w:t>mplete” and that the action is within the review window.</w:t>
+        <w:t>4. System validates that the order status is “Inspection Complete” and that the action is within the review window.</w:t>
       </w:r>
     </w:p>
     <w:p>
@@ -2100,10 +1960,7 @@
         <w:spacing w:after="60"/>
       </w:pPr>
       <w:r>
-        <w:t>8. Use case ends</w:t>
-      </w:r>
-      <w:r>
-        <w:t>.</w:t>
+        <w:t>8. Use case ends.</w:t>
       </w:r>
     </w:p>
     <w:p>
@@ -2167,10 +2024,7 @@
         <w:spacing w:after="60"/>
       </w:pPr>
       <w:r>
-        <w:t xml:space="preserve">3d. Use case ends; resolution continues under </w:t>
-      </w:r>
-      <w:r>
-        <w:t>“Resolve Dispute &amp; Refund.”</w:t>
+        <w:t>3d. Use case ends; resolution continues under “Resolve Dispute &amp; Refund.”</w:t>
       </w:r>
     </w:p>
     <w:sectPr>
@@ -3115,7 +2969,7 @@
 </file>
 
 <file path=customXml/itemProps1.xml><?xml version="1.0" encoding="utf-8"?>
-<ds:datastoreItem xmlns:ds="http://schemas.openxmlformats.org/officeDocument/2006/customXml" ds:itemID="{6531D150-EE88-44D5-AB9F-22073C8A4A4A}">
+<ds:datastoreItem xmlns:ds="http://schemas.openxmlformats.org/officeDocument/2006/customXml" ds:itemID="{DB673F59-2A41-4468-8136-2E39D063A21F}">
   <ds:schemaRefs>
     <ds:schemaRef ds:uri="http://schemas.openxmlformats.org/officeDocument/2006/bibliography"/>
   </ds:schemaRefs>

</xml_diff>